<commit_message>
Adv: Actualización archivo docx
</commit_message>
<xml_diff>
--- a/Encargo_Semana_01.docx
+++ b/Encargo_Semana_01.docx
@@ -10,7 +10,7 @@
       <w:r>
         <w:rPr/>
         <w:drawing>
-          <wp:anchor distT="0" distB="0" distL="0" distR="0" simplePos="0" relativeHeight="32" behindDoc="0" locked="0" layoutInCell="1" allowOverlap="1">
+          <wp:anchor distT="0" distB="0" distL="0" distR="0" simplePos="0" relativeHeight="34" behindDoc="0" locked="0" layoutInCell="1" allowOverlap="1">
             <wp:simplePos x="0" y="0"/>
             <wp:positionH relativeFrom="column">
               <wp:posOffset>-434340</wp:posOffset>
@@ -64,7 +64,7 @@
         <mc:AlternateContent>
           <mc:Choice Requires="wps">
             <w:drawing>
-              <wp:anchor distT="635" distB="635" distL="1270" distR="635" simplePos="0" relativeHeight="33" behindDoc="0" locked="0" layoutInCell="1" allowOverlap="1" wp14:anchorId="56D2B23C">
+              <wp:anchor distT="635" distB="635" distL="1270" distR="635" simplePos="0" relativeHeight="35" behindDoc="0" locked="0" layoutInCell="1" allowOverlap="1" wp14:anchorId="56D2B23C">
                 <wp:simplePos x="0" y="0"/>
                 <wp:positionH relativeFrom="column">
                   <wp:posOffset>1927860</wp:posOffset>
@@ -131,7 +131,7 @@
         <mc:AlternateContent>
           <mc:Choice Requires="wps">
             <w:drawing>
-              <wp:anchor distT="635" distB="635" distL="635" distR="1270" simplePos="0" relativeHeight="34" behindDoc="0" locked="0" layoutInCell="1" allowOverlap="1" wp14:anchorId="36699E54">
+              <wp:anchor distT="635" distB="635" distL="635" distR="1270" simplePos="0" relativeHeight="36" behindDoc="0" locked="0" layoutInCell="1" allowOverlap="1" wp14:anchorId="36699E54">
                 <wp:simplePos x="0" y="0"/>
                 <wp:positionH relativeFrom="column">
                   <wp:posOffset>-325120</wp:posOffset>
@@ -291,7 +291,7 @@
         <mc:AlternateContent>
           <mc:Choice Requires="wps">
             <w:drawing>
-              <wp:anchor distT="635" distB="0" distL="635" distR="635" simplePos="0" relativeHeight="35" behindDoc="0" locked="0" layoutInCell="1" allowOverlap="1" wp14:anchorId="3BFABDE3">
+              <wp:anchor distT="635" distB="0" distL="635" distR="635" simplePos="0" relativeHeight="37" behindDoc="0" locked="0" layoutInCell="1" allowOverlap="1" wp14:anchorId="3BFABDE3">
                 <wp:simplePos x="0" y="0"/>
                 <wp:positionH relativeFrom="column">
                   <wp:posOffset>-318135</wp:posOffset>
@@ -450,11 +450,7 @@
             </w:r>
             <w:r>
               <w:rPr/>
-              <w:t> </w:t>
-            </w:r>
-            <w:r>
-              <w:rPr/>
-              <w:t>Yerko Cortés Baeza</w:t>
+              <w:t> Yerko Cortés Baeza - Chistopher Zuniga Maldonado</w:t>
             </w:r>
           </w:p>
         </w:tc>
@@ -520,11 +516,7 @@
             </w:r>
             <w:r>
               <w:rPr/>
-              <w:t> </w:t>
-            </w:r>
-            <w:r>
-              <w:rPr/>
-              <w:t>Modelamiento de base de datos</w:t>
+              <w:t> Modelamiento de base de datos</w:t>
             </w:r>
           </w:p>
         </w:tc>
@@ -558,11 +550,7 @@
             </w:r>
             <w:r>
               <w:rPr/>
-              <w:t> </w:t>
-            </w:r>
-            <w:r>
-              <w:rPr/>
-              <w:t>Analista Programador Computacional</w:t>
+              <w:t> Analista Programador Computacional</w:t>
             </w:r>
           </w:p>
         </w:tc>
@@ -601,11 +589,7 @@
             </w:r>
             <w:r>
               <w:rPr/>
-              <w:t> </w:t>
-            </w:r>
-            <w:r>
-              <w:rPr/>
-              <w:t>Armando Romero Muñoz</w:t>
+              <w:t> Armando Romero Muñoz</w:t>
             </w:r>
           </w:p>
         </w:tc>
@@ -639,11 +623,7 @@
             </w:r>
             <w:r>
               <w:rPr/>
-              <w:t> </w:t>
-            </w:r>
-            <w:r>
-              <w:rPr/>
-              <w:t>17-08-2026</w:t>
+              <w:t> 17-08-2026</w:t>
             </w:r>
           </w:p>
         </w:tc>
@@ -1654,7 +1634,7 @@
         <mc:AlternateContent>
           <mc:Choice Requires="wps">
             <w:drawing>
-              <wp:anchor distT="40005" distB="56515" distL="109220" distR="118110" simplePos="0" relativeHeight="38" behindDoc="0" locked="0" layoutInCell="0" allowOverlap="1" wp14:anchorId="134E6B5A">
+              <wp:anchor distT="40005" distB="53975" distL="109220" distR="118110" simplePos="0" relativeHeight="40" behindDoc="0" locked="0" layoutInCell="0" allowOverlap="1" wp14:anchorId="134E6B5A">
                 <wp:simplePos x="0" y="0"/>
                 <wp:positionH relativeFrom="column">
                   <wp:posOffset>72390</wp:posOffset>
@@ -1742,7 +1722,7 @@
           </mc:Fallback>
         </mc:AlternateContent>
         <w:drawing>
-          <wp:anchor distT="0" distB="0" distL="0" distR="0" simplePos="0" relativeHeight="42" behindDoc="0" locked="0" layoutInCell="0" allowOverlap="1">
+          <wp:anchor distT="0" distB="0" distL="0" distR="0" simplePos="0" relativeHeight="44" behindDoc="0" locked="0" layoutInCell="0" allowOverlap="1">
             <wp:simplePos x="0" y="0"/>
             <wp:positionH relativeFrom="column">
               <wp:align>center</wp:align>
@@ -1802,7 +1782,7 @@
         <mc:AlternateContent>
           <mc:Choice Requires="wps">
             <w:drawing>
-              <wp:anchor distT="40005" distB="55245" distL="109220" distR="118110" simplePos="0" relativeHeight="40" behindDoc="0" locked="0" layoutInCell="0" allowOverlap="1" wp14:anchorId="4ECE7D76">
+              <wp:anchor distT="40005" distB="52705" distL="109220" distR="118110" simplePos="0" relativeHeight="42" behindDoc="0" locked="0" layoutInCell="0" allowOverlap="1" wp14:anchorId="4ECE7D76">
                 <wp:simplePos x="0" y="0"/>
                 <wp:positionH relativeFrom="column">
                   <wp:posOffset>2540</wp:posOffset>
@@ -1890,7 +1870,7 @@
           </mc:Fallback>
         </mc:AlternateContent>
         <w:drawing>
-          <wp:anchor distT="0" distB="0" distL="0" distR="0" simplePos="0" relativeHeight="43" behindDoc="0" locked="0" layoutInCell="0" allowOverlap="1">
+          <wp:anchor distT="0" distB="0" distL="0" distR="0" simplePos="0" relativeHeight="45" behindDoc="0" locked="0" layoutInCell="0" allowOverlap="1">
             <wp:simplePos x="0" y="0"/>
             <wp:positionH relativeFrom="column">
               <wp:align>center</wp:align>
@@ -3189,7 +3169,7 @@
         <mc:AlternateContent>
           <mc:Choice Requires="wps">
             <w:drawing>
-              <wp:anchor distT="1270" distB="0" distL="1270" distR="0" simplePos="0" relativeHeight="36" behindDoc="0" locked="0" layoutInCell="1" allowOverlap="1" wp14:anchorId="71A805CC">
+              <wp:anchor distT="1270" distB="0" distL="1270" distR="0" simplePos="0" relativeHeight="38" behindDoc="0" locked="0" layoutInCell="1" allowOverlap="1" wp14:anchorId="71A805CC">
                 <wp:simplePos x="0" y="0"/>
                 <wp:positionH relativeFrom="column">
                   <wp:posOffset>-375285</wp:posOffset>
@@ -3290,7 +3270,7 @@
       <w:r>
         <w:rPr/>
         <w:drawing>
-          <wp:anchor distT="0" distB="0" distL="0" distR="0" simplePos="0" relativeHeight="37" behindDoc="0" locked="0" layoutInCell="1" allowOverlap="1">
+          <wp:anchor distT="0" distB="0" distL="0" distR="0" simplePos="0" relativeHeight="39" behindDoc="0" locked="0" layoutInCell="1" allowOverlap="1">
             <wp:simplePos x="0" y="0"/>
             <wp:positionH relativeFrom="column">
               <wp:posOffset>1642745</wp:posOffset>
@@ -3490,7 +3470,7 @@
           <mc:AlternateContent>
             <mc:Choice Requires="wpg">
               <w:drawing>
-                <wp:anchor distT="10795" distB="1270" distL="9525" distR="10160" simplePos="0" relativeHeight="21" behindDoc="1" locked="0" layoutInCell="1" allowOverlap="1" wp14:anchorId="0A2BBC52">
+                <wp:anchor distT="10795" distB="635" distL="9525" distR="10160" simplePos="0" relativeHeight="23" behindDoc="1" locked="0" layoutInCell="1" allowOverlap="1" wp14:anchorId="0A2BBC52">
                   <wp:simplePos x="0" y="0"/>
                   <wp:positionH relativeFrom="column">
                     <wp:posOffset>5206365</wp:posOffset>
@@ -3498,7 +3478,7 @@
                   <wp:positionV relativeFrom="paragraph">
                     <wp:posOffset>-47625</wp:posOffset>
                   </wp:positionV>
-                  <wp:extent cx="1194435" cy="287020"/>
+                  <wp:extent cx="1191895" cy="284480"/>
                   <wp:effectExtent l="10795" t="10160" r="9525" b="1270"/>
                   <wp:wrapNone/>
                   <wp:docPr id="11" name="Grupo 1"/>
@@ -3509,9 +3489,9 @@
                         <wpg:grpSpPr>
                           <a:xfrm>
                             <a:off x="0" y="0"/>
-                            <a:ext cx="1194480" cy="286920"/>
+                            <a:ext cx="1191960" cy="284400"/>
                             <a:chOff x="0" y="0"/>
-                            <a:chExt cx="1194480" cy="286920"/>
+                            <a:chExt cx="1191960" cy="284400"/>
                           </a:xfrm>
                         </wpg:grpSpPr>
                         <pic:pic xmlns:pic="http://schemas.openxmlformats.org/drawingml/2006/picture">
@@ -3526,7 +3506,7 @@
                           <pic:spPr>
                             <a:xfrm>
                               <a:off x="60480" y="0"/>
-                              <a:ext cx="805320" cy="286920"/>
+                              <a:ext cx="802800" cy="284400"/>
                             </a:xfrm>
                             <a:prstGeom prst="rect">
                               <a:avLst/>
@@ -3543,7 +3523,7 @@
                           <wps:spPr>
                             <a:xfrm>
                               <a:off x="0" y="0"/>
-                              <a:ext cx="1194480" cy="278280"/>
+                              <a:ext cx="1191960" cy="275760"/>
                             </a:xfrm>
                             <a:prstGeom prst="roundRect">
                               <a:avLst>
@@ -3611,7 +3591,7 @@
             </mc:Choice>
             <mc:Fallback>
               <w:pict>
-                <v:group id="shape_0" alt="Grupo 1" style="position:absolute;margin-left:409.95pt;margin-top:-3.75pt;width:94.05pt;height:22.6pt" coordorigin="8199,-75" coordsize="1881,452">
+                <v:group id="shape_0" alt="Grupo 1" style="position:absolute;margin-left:409.95pt;margin-top:-3.75pt;width:93.85pt;height:22.4pt" coordorigin="8199,-75" coordsize="1877,448">
                   <v:shapetype id="_x0000_t75" coordsize="21600,21600" o:spt="75" o:preferrelative="t" path="m@4@5l@4@11@9@11@9@5xe" filled="f" stroked="f">
                     <v:stroke joinstyle="miter"/>
                     <v:formulas>
@@ -3631,12 +3611,12 @@
                     <v:path o:extrusionok="f" gradientshapeok="t" o:connecttype="rect"/>
                     <o:lock v:ext="edit" aspectratio="t"/>
                   </v:shapetype>
-                  <v:shape id="shape_0" stroked="f" o:allowincell="f" style="position:absolute;left:8294;top:-75;width:1267;height:451;mso-wrap-style:none;v-text-anchor:middle" type="_x0000_t75">
+                  <v:shape id="shape_0" stroked="f" o:allowincell="f" style="position:absolute;left:8294;top:-75;width:1263;height:447;mso-wrap-style:none;v-text-anchor:middle" type="_x0000_t75">
                     <v:imagedata r:id="rId2" o:detectmouseclick="t"/>
                     <v:stroke color="#3465a4" joinstyle="round" endcap="flat"/>
                     <w10:wrap type="none"/>
                   </v:shape>
-                  <v:roundrect id="shape_0" stroked="t" o:allowincell="f" style="position:absolute;left:8199;top:-75;width:1880;height:437;mso-wrap-style:none;v-text-anchor:middle">
+                  <v:roundrect id="shape_0" stroked="t" o:allowincell="f" style="position:absolute;left:8199;top:-75;width:1876;height:433;mso-wrap-style:none;v-text-anchor:middle">
                     <v:fill o:detectmouseclick="t" on="false"/>
                     <v:stroke color="#d9d9d9" weight="19080" joinstyle="miter" endcap="flat"/>
                     <w10:wrap type="none"/>
@@ -3662,7 +3642,7 @@
         </w:r>
         <w:r>
           <w:rPr/>
-          <w:t>6</w:t>
+          <w:t>7</w:t>
         </w:r>
         <w:r>
           <w:rPr/>
@@ -3724,7 +3704,7 @@
           <mc:AlternateContent>
             <mc:Choice Requires="wpg">
               <w:drawing>
-                <wp:anchor distT="10795" distB="1270" distL="9525" distR="10160" simplePos="0" relativeHeight="31" behindDoc="1" locked="0" layoutInCell="1" allowOverlap="1" wp14:anchorId="0A2BBC52">
+                <wp:anchor distT="10795" distB="635" distL="9525" distR="10160" simplePos="0" relativeHeight="33" behindDoc="1" locked="0" layoutInCell="1" allowOverlap="1" wp14:anchorId="0A2BBC52">
                   <wp:simplePos x="0" y="0"/>
                   <wp:positionH relativeFrom="column">
                     <wp:posOffset>5206365</wp:posOffset>
@@ -3732,7 +3712,7 @@
                   <wp:positionV relativeFrom="paragraph">
                     <wp:posOffset>-47625</wp:posOffset>
                   </wp:positionV>
-                  <wp:extent cx="1194435" cy="287020"/>
+                  <wp:extent cx="1191895" cy="284480"/>
                   <wp:effectExtent l="10795" t="10160" r="9525" b="1270"/>
                   <wp:wrapNone/>
                   <wp:docPr id="26" name="Grupo 2"/>
@@ -3743,9 +3723,9 @@
                         <wpg:grpSpPr>
                           <a:xfrm>
                             <a:off x="0" y="0"/>
-                            <a:ext cx="1194480" cy="286920"/>
+                            <a:ext cx="1191960" cy="284400"/>
                             <a:chOff x="0" y="0"/>
-                            <a:chExt cx="1194480" cy="286920"/>
+                            <a:chExt cx="1191960" cy="284400"/>
                           </a:xfrm>
                         </wpg:grpSpPr>
                         <pic:pic xmlns:pic="http://schemas.openxmlformats.org/drawingml/2006/picture">
@@ -3760,7 +3740,7 @@
                           <pic:spPr>
                             <a:xfrm>
                               <a:off x="60480" y="0"/>
-                              <a:ext cx="805320" cy="286920"/>
+                              <a:ext cx="802800" cy="284400"/>
                             </a:xfrm>
                             <a:prstGeom prst="rect">
                               <a:avLst/>
@@ -3777,7 +3757,7 @@
                           <wps:spPr>
                             <a:xfrm>
                               <a:off x="0" y="0"/>
-                              <a:ext cx="1194480" cy="278280"/>
+                              <a:ext cx="1191960" cy="275760"/>
                             </a:xfrm>
                             <a:prstGeom prst="roundRect">
                               <a:avLst>
@@ -3845,13 +3825,13 @@
             </mc:Choice>
             <mc:Fallback>
               <w:pict>
-                <v:group id="shape_0" alt="Grupo 2" style="position:absolute;margin-left:409.95pt;margin-top:-3.75pt;width:94.05pt;height:22.6pt" coordorigin="8199,-75" coordsize="1881,452">
-                  <v:shape id="shape_0" stroked="f" o:allowincell="f" style="position:absolute;left:8294;top:-75;width:1267;height:451;mso-wrap-style:none;v-text-anchor:middle" type="_x0000_t75">
+                <v:group id="shape_0" alt="Grupo 2" style="position:absolute;margin-left:409.95pt;margin-top:-3.75pt;width:93.85pt;height:22.4pt" coordorigin="8199,-75" coordsize="1877,448">
+                  <v:shape id="shape_0" stroked="f" o:allowincell="f" style="position:absolute;left:8294;top:-75;width:1263;height:447;mso-wrap-style:none;v-text-anchor:middle" type="_x0000_t75">
                     <v:imagedata r:id="rId2" o:detectmouseclick="t"/>
                     <v:stroke color="#3465a4" joinstyle="round" endcap="flat"/>
                     <w10:wrap type="none"/>
                   </v:shape>
-                  <v:roundrect id="shape_0" stroked="t" o:allowincell="f" style="position:absolute;left:8199;top:-75;width:1880;height:437;mso-wrap-style:none;v-text-anchor:middle">
+                  <v:roundrect id="shape_0" stroked="t" o:allowincell="f" style="position:absolute;left:8199;top:-75;width:1876;height:433;mso-wrap-style:none;v-text-anchor:middle">
                     <v:fill o:detectmouseclick="t" on="false"/>
                     <v:stroke color="#d9d9d9" weight="19080" joinstyle="miter" endcap="flat"/>
                     <w10:wrap type="none"/>
@@ -3877,7 +3857,7 @@
         </w:r>
         <w:r>
           <w:rPr/>
-          <w:t>12</w:t>
+          <w:t>13</w:t>
         </w:r>
         <w:r>
           <w:rPr/>
@@ -3927,7 +3907,7 @@
     <w:r>
       <w:rPr/>
       <w:drawing>
-        <wp:anchor distT="0" distB="0" distL="0" distR="0" simplePos="0" relativeHeight="16" behindDoc="1" locked="0" layoutInCell="0" allowOverlap="1">
+        <wp:anchor distT="0" distB="0" distL="0" distR="0" simplePos="0" relativeHeight="17" behindDoc="1" locked="0" layoutInCell="0" allowOverlap="1">
           <wp:simplePos x="0" y="0"/>
           <wp:positionH relativeFrom="margin">
             <wp:posOffset>4344670</wp:posOffset>
@@ -4021,7 +4001,7 @@
     <w:r>
       <w:rPr/>
       <w:drawing>
-        <wp:anchor distT="0" distB="0" distL="0" distR="0" simplePos="0" relativeHeight="26" behindDoc="1" locked="0" layoutInCell="0" allowOverlap="1">
+        <wp:anchor distT="0" distB="0" distL="0" distR="0" simplePos="0" relativeHeight="28" behindDoc="1" locked="0" layoutInCell="0" allowOverlap="1">
           <wp:simplePos x="0" y="0"/>
           <wp:positionH relativeFrom="margin">
             <wp:posOffset>4344670</wp:posOffset>

</xml_diff>